<commit_message>
feat: add D-CLIC Sequence 3 presentation, automation script, and supplemental resources
</commit_message>
<xml_diff>
--- a/Messages/semaine4.docx
+++ b/Messages/semaine4.docx
@@ -545,6 +545,378 @@
         <w:t xml:space="preserve">Merci d'avance pour votre réactivité et à tout à l'heure ! </w:t>
       </w:r>
     </w:p>
+    <w:p/>
+    <w:p/>
+    <w:p/>
+    <w:p/>
+    <w:p/>
+    <w:p/>
+    <w:p/>
+    <w:p>
+      <w:r>
+        <w:lastRenderedPageBreak/>
+        <w:t xml:space="preserve">Comme évoqué durant nos échanges, pour vous aider à approfondir vos compétences en gestion de projet et mieux comprendre les différentes méthodologies, voici deux formations complémentaires très utiles sur </w:t>
+      </w:r>
+      <w:proofErr w:type="spellStart"/>
+      <w:r>
+        <w:t>OpenClassrooms</w:t>
+      </w:r>
+      <w:proofErr w:type="spellEnd"/>
+      <w:r>
+        <w:t xml:space="preserve"> :</w:t>
+      </w:r>
+    </w:p>
+    <w:p>
+      <w:r>
+        <w:rPr>
+          <w:rFonts w:ascii="Segoe UI Emoji" w:hAnsi="Segoe UI Emoji" w:cs="Segoe UI Emoji"/>
+        </w:rPr>
+        <w:t>🔹</w:t>
+      </w:r>
+      <w:r>
+        <w:t xml:space="preserve"> </w:t>
+      </w:r>
+      <w:r>
+        <w:rPr>
+          <w:b/>
+          <w:bCs/>
+        </w:rPr>
+        <w:t>Gérer un projet digital avec une méthodologie en cascade :</w:t>
+      </w:r>
+    </w:p>
+    <w:p>
+      <w:r>
+        <w:rPr>
+          <w:rFonts w:ascii="Segoe UI Emoji" w:hAnsi="Segoe UI Emoji" w:cs="Segoe UI Emoji"/>
+        </w:rPr>
+        <w:t>👉</w:t>
+      </w:r>
+      <w:r>
+        <w:t xml:space="preserve"> </w:t>
+      </w:r>
+      <w:hyperlink r:id="rId5" w:tgtFrame="_blank" w:history="1">
+        <w:r>
+          <w:rPr>
+            <w:rStyle w:val="Lienhypertexte"/>
+          </w:rPr>
+          <w:t>https://openclassrooms.com/fr/courses/4296701-gerez-un-projet-digital-avec-une-methodologie-en-cascade</w:t>
+        </w:r>
+      </w:hyperlink>
+    </w:p>
+    <w:p>
+      <w:r>
+        <w:rPr>
+          <w:rFonts w:ascii="Segoe UI Emoji" w:hAnsi="Segoe UI Emoji" w:cs="Segoe UI Emoji"/>
+        </w:rPr>
+        <w:t>🔹</w:t>
+      </w:r>
+      <w:r>
+        <w:t xml:space="preserve"> </w:t>
+      </w:r>
+      <w:r>
+        <w:rPr>
+          <w:b/>
+          <w:bCs/>
+        </w:rPr>
+        <w:t>Gérer un projet avec la méthodologie cycle en V :</w:t>
+      </w:r>
+    </w:p>
+    <w:p>
+      <w:r>
+        <w:rPr>
+          <w:rFonts w:ascii="Segoe UI Emoji" w:hAnsi="Segoe UI Emoji" w:cs="Segoe UI Emoji"/>
+        </w:rPr>
+        <w:t>👉</w:t>
+      </w:r>
+      <w:r>
+        <w:t xml:space="preserve"> </w:t>
+      </w:r>
+      <w:hyperlink r:id="rId6" w:tgtFrame="_blank" w:history="1">
+        <w:r>
+          <w:rPr>
+            <w:rStyle w:val="Lienhypertexte"/>
+          </w:rPr>
+          <w:t>https://openclassrooms.com/fr/courses/8186936-gerez-un-projet-avec-la-methodologie-cycle-en-v</w:t>
+        </w:r>
+      </w:hyperlink>
+    </w:p>
+    <w:p>
+      <w:r>
+        <w:t>Ces ressources vous donneront des bases solides pour la structuration de vos projets à venir.</w:t>
+      </w:r>
+    </w:p>
+    <w:p/>
+    <w:p/>
+    <w:p>
+      <w:r>
+        <w:t xml:space="preserve">Bonjour à toutes et à tous </w:t>
+      </w:r>
+      <w:r>
+        <w:rPr>
+          <w:rFonts w:ascii="Segoe UI Emoji" w:hAnsi="Segoe UI Emoji" w:cs="Segoe UI Emoji"/>
+        </w:rPr>
+        <w:t>👋</w:t>
+      </w:r>
+    </w:p>
+    <w:p>
+      <w:r>
+        <w:t>Comme annoncé suite à nos récents échanges, nous avons réorganisé le calendrier de nos rencontres en direct afin d'éviter les contraintes du week-end et de vous proposer des créneaux plus adaptés.</w:t>
+      </w:r>
+    </w:p>
+    <w:p>
+      <w:r>
+        <w:t xml:space="preserve">Désormais, nos deux sessions hebdomadaires d'accompagnement se dérouleront de </w:t>
+      </w:r>
+      <w:proofErr w:type="spellStart"/>
+      <w:r>
+        <w:rPr>
+          <w:b/>
+          <w:bCs/>
+        </w:rPr>
+        <w:t>19h00</w:t>
+      </w:r>
+      <w:proofErr w:type="spellEnd"/>
+      <w:r>
+        <w:rPr>
+          <w:b/>
+          <w:bCs/>
+        </w:rPr>
+        <w:t xml:space="preserve"> à </w:t>
+      </w:r>
+      <w:proofErr w:type="spellStart"/>
+      <w:r>
+        <w:rPr>
+          <w:b/>
+          <w:bCs/>
+        </w:rPr>
+        <w:t>20h00</w:t>
+      </w:r>
+      <w:proofErr w:type="spellEnd"/>
+      <w:r>
+        <w:rPr>
+          <w:b/>
+          <w:bCs/>
+        </w:rPr>
+        <w:t xml:space="preserve"> </w:t>
+      </w:r>
+      <w:r>
+        <w:rPr>
+          <w:b/>
+          <w:bCs/>
+        </w:rPr>
+        <w:t>GMT</w:t>
+      </w:r>
+      <w:r>
+        <w:t>.</w:t>
+      </w:r>
+    </w:p>
+    <w:p>
+      <w:r>
+        <w:t xml:space="preserve">Vous pouvez directement ajouter les rendez-vous à votre agenda et réserver votre présence via les liens Google </w:t>
+      </w:r>
+      <w:proofErr w:type="spellStart"/>
+      <w:r>
+        <w:t>Calendar</w:t>
+      </w:r>
+      <w:proofErr w:type="spellEnd"/>
+      <w:r>
+        <w:t xml:space="preserve"> ci-dessous :</w:t>
+      </w:r>
+    </w:p>
+    <w:p>
+      <w:r>
+        <w:rPr>
+          <w:b/>
+          <w:bCs/>
+        </w:rPr>
+        <w:t>Session du Mardi (</w:t>
+      </w:r>
+      <w:proofErr w:type="spellStart"/>
+      <w:r>
+        <w:rPr>
+          <w:b/>
+          <w:bCs/>
+        </w:rPr>
+        <w:t>19h00</w:t>
+      </w:r>
+      <w:proofErr w:type="spellEnd"/>
+      <w:r>
+        <w:rPr>
+          <w:b/>
+          <w:bCs/>
+        </w:rPr>
+        <w:t xml:space="preserve"> – </w:t>
+      </w:r>
+      <w:proofErr w:type="spellStart"/>
+      <w:r>
+        <w:rPr>
+          <w:b/>
+          <w:bCs/>
+        </w:rPr>
+        <w:t>20h00</w:t>
+      </w:r>
+      <w:proofErr w:type="spellEnd"/>
+      <w:r>
+        <w:rPr>
+          <w:b/>
+          <w:bCs/>
+        </w:rPr>
+        <w:t xml:space="preserve"> GMT</w:t>
+      </w:r>
+      <w:r>
+        <w:rPr>
+          <w:b/>
+          <w:bCs/>
+        </w:rPr>
+        <w:t>) :</w:t>
+      </w:r>
+    </w:p>
+    <w:p>
+      <w:r>
+        <w:rPr>
+          <w:rFonts w:ascii="Segoe UI Emoji" w:hAnsi="Segoe UI Emoji" w:cs="Segoe UI Emoji"/>
+        </w:rPr>
+        <w:t>👉</w:t>
+      </w:r>
+      <w:r>
+        <w:t xml:space="preserve"> </w:t>
+      </w:r>
+      <w:hyperlink r:id="rId7" w:history="1">
+        <w:r>
+          <w:rPr>
+            <w:rStyle w:val="Lienhypertexte"/>
+          </w:rPr>
+          <w:t>https://</w:t>
+        </w:r>
+        <w:proofErr w:type="spellStart"/>
+        <w:r>
+          <w:rPr>
+            <w:rStyle w:val="Lienhypertexte"/>
+          </w:rPr>
+          <w:t>calendar.app.google</w:t>
+        </w:r>
+        <w:proofErr w:type="spellEnd"/>
+        <w:r>
+          <w:rPr>
+            <w:rStyle w:val="Lienhypertexte"/>
+          </w:rPr>
+          <w:t>/</w:t>
+        </w:r>
+        <w:proofErr w:type="spellStart"/>
+        <w:r>
+          <w:rPr>
+            <w:rStyle w:val="Lienhypertexte"/>
+          </w:rPr>
+          <w:t>Pf6hPJxeuNtcne3H9</w:t>
+        </w:r>
+        <w:proofErr w:type="spellEnd"/>
+      </w:hyperlink>
+    </w:p>
+    <w:p/>
+    <w:p>
+      <w:r>
+        <w:rPr>
+          <w:b/>
+          <w:bCs/>
+        </w:rPr>
+        <w:t>Session du Vendredi (</w:t>
+      </w:r>
+      <w:proofErr w:type="spellStart"/>
+      <w:r>
+        <w:rPr>
+          <w:b/>
+          <w:bCs/>
+        </w:rPr>
+        <w:t>19h00</w:t>
+      </w:r>
+      <w:proofErr w:type="spellEnd"/>
+      <w:r>
+        <w:rPr>
+          <w:b/>
+          <w:bCs/>
+        </w:rPr>
+        <w:t xml:space="preserve"> – </w:t>
+      </w:r>
+      <w:proofErr w:type="spellStart"/>
+      <w:r>
+        <w:rPr>
+          <w:b/>
+          <w:bCs/>
+        </w:rPr>
+        <w:t>20h00</w:t>
+      </w:r>
+      <w:proofErr w:type="spellEnd"/>
+      <w:r>
+        <w:rPr>
+          <w:b/>
+          <w:bCs/>
+        </w:rPr>
+        <w:t xml:space="preserve"> GMT</w:t>
+      </w:r>
+      <w:r>
+        <w:rPr>
+          <w:b/>
+          <w:bCs/>
+        </w:rPr>
+        <w:t>) :</w:t>
+      </w:r>
+    </w:p>
+    <w:p>
+      <w:r>
+        <w:rPr>
+          <w:rFonts w:ascii="Segoe UI Emoji" w:hAnsi="Segoe UI Emoji" w:cs="Segoe UI Emoji"/>
+        </w:rPr>
+        <w:t>👉</w:t>
+      </w:r>
+      <w:r>
+        <w:t xml:space="preserve"> https://</w:t>
+      </w:r>
+      <w:proofErr w:type="spellStart"/>
+      <w:r>
+        <w:t>calendar.app.google</w:t>
+      </w:r>
+      <w:proofErr w:type="spellEnd"/>
+      <w:r>
+        <w:t>/</w:t>
+      </w:r>
+      <w:proofErr w:type="spellStart"/>
+      <w:r>
+        <w:t>GL1kyZhTY9aJ4frEA</w:t>
+      </w:r>
+      <w:proofErr w:type="spellEnd"/>
+    </w:p>
+    <w:p>
+      <w:pPr>
+        <w:rPr>
+          <w:rFonts w:ascii="Segoe UI Emoji" w:hAnsi="Segoe UI Emoji" w:cs="Segoe UI Emoji"/>
+        </w:rPr>
+      </w:pPr>
+    </w:p>
+    <w:p>
+      <w:r>
+        <w:t>Cliquez sur chacun des liens pour enregistrer l'événement dans votre calendrier. Vous recevrez ainsi un rappel automatique directement sur votre téléphone ou boîte mail avant chaque session !</w:t>
+      </w:r>
+    </w:p>
+    <w:p>
+      <w:r>
+        <w:t>Pensez à bien réserver vos créneaux et à bloquer ces moments dans votre emploi du temps.</w:t>
+      </w:r>
+    </w:p>
+    <w:p>
+      <w:r>
+        <w:t xml:space="preserve">Excellente fin de journée et bon travail à tous ! </w:t>
+      </w:r>
+    </w:p>
+    <w:p>
+      <w:r>
+        <w:rPr>
+          <w:b/>
+          <w:bCs/>
+        </w:rPr>
+        <w:t>Jesse</w:t>
+      </w:r>
+    </w:p>
+    <w:p/>
     <w:p/>
     <w:p/>
     <w:p/>
@@ -1470,7 +1842,6 @@
   <w:style w:type="character" w:default="1" w:styleId="Policepardfaut">
     <w:name w:val="Default Paragraph Font"/>
     <w:uiPriority w:val="1"/>
-    <w:semiHidden/>
     <w:unhideWhenUsed/>
   </w:style>
   <w:style w:type="table" w:default="1" w:styleId="TableauNormal">
@@ -1782,6 +2153,29 @@
       <w:smallCaps/>
       <w:color w:val="0F4761" w:themeColor="accent1" w:themeShade="BF"/>
       <w:spacing w:val="5"/>
+    </w:rPr>
+  </w:style>
+  <w:style w:type="character" w:styleId="Lienhypertexte">
+    <w:name w:val="Hyperlink"/>
+    <w:basedOn w:val="Policepardfaut"/>
+    <w:uiPriority w:val="99"/>
+    <w:unhideWhenUsed/>
+    <w:rsid w:val="00875C76"/>
+    <w:rPr>
+      <w:color w:val="467886" w:themeColor="hyperlink"/>
+      <w:u w:val="single"/>
+    </w:rPr>
+  </w:style>
+  <w:style w:type="character" w:styleId="Mentionnonrsolue">
+    <w:name w:val="Unresolved Mention"/>
+    <w:basedOn w:val="Policepardfaut"/>
+    <w:uiPriority w:val="99"/>
+    <w:semiHidden/>
+    <w:unhideWhenUsed/>
+    <w:rsid w:val="00875C76"/>
+    <w:rPr>
+      <w:color w:val="605E5C"/>
+      <w:shd w:val="clear" w:color="auto" w:fill="E1DFDD"/>
     </w:rPr>
   </w:style>
 </w:styles>

</xml_diff>